<commit_message>
Modified Namings to Formal
</commit_message>
<xml_diff>
--- a/docs/Aged_Ticket_Advisor_User_Manual.docx
+++ b/docs/Aged_Ticket_Advisor_User_Manual.docx
@@ -304,7 +304,7 @@
               <w:rPr>
                 <w:sz w:val="19"/>
               </w:rPr>
-              <w:t>1.0  ·  24 September 2026</w:t>
+              <w:t>1.0  ·  01 October 2026</w:t>
             </w:r>
           </w:p>
         </w:tc>
@@ -341,7 +341,7 @@
           <w:color w:val="52514E"/>
           <w:sz w:val="20"/>
         </w:rPr>
-        <w:t>Section 1 (what this is and is not), Section 2.2 (the "blocked by" idea — the one concept that makes everything else make sense), and then either Section 4 if you are an agent or Section 5 if you are a lead. Twenty minutes total. Everything else is reference you can come back to.</w:t>
+        <w:t>Section 1 (what this is and is not), Section 2.2 (the pending action owner — the one concept that makes everything else make sense), and then either Section 4 if you are an agent or Section 5 if you are a lead. Twenty minutes total. Everything else is reference you can come back to.</w:t>
       </w:r>
     </w:p>
     <w:p>
@@ -2211,7 +2211,7 @@
               <w:rPr>
                 <w:sz w:val="19"/>
               </w:rPr>
-              <w:t>The caller adding a comment (that is their activity, not ours — and it usually means we now owe a reply)</w:t>
+              <w:t>The caller adding a comment (that is caller activity, not Service Desk activity — and it usually means a response is now owed)</w:t>
             </w:r>
           </w:p>
         </w:tc>
@@ -2227,7 +2227,7 @@
         <w:pStyle w:val="Heading2"/>
       </w:pPr>
       <w:r>
-        <w:t>2.2 Blocked by — the important one</w:t>
+        <w:t>2.2 Pending action owner — the key field</w:t>
       </w:r>
     </w:p>
     <w:p>
@@ -2237,7 +2237,7 @@
           <w:i w:val="0"/>
           <w:sz w:val="21"/>
         </w:rPr>
-        <w:t>Every aged ticket gets a "Blocked by" value. This is the tool answering the question leads actually care about: is this one ours to move, or are we legitimately waiting?</w:t>
+        <w:t>Every aged incident is assigned a Pending Action Owner. This answers the question that matters most to a lead: is this incident awaiting Service Desk action, or is it legitimately awaiting another party?</w:t>
       </w:r>
     </w:p>
     <w:tbl>
@@ -2256,7 +2256,7 @@
       <w:tr>
         <w:tc>
           <w:tcPr>
-            <w:tcW w:type="dxa" w:w="1474"/>
+            <w:tcW w:type="dxa" w:w="1644"/>
             <w:shd w:val="clear" w:color="auto" w:fill="E8E8E3"/>
           </w:tcPr>
           <w:p>
@@ -2269,13 +2269,13 @@
                 <w:b/>
                 <w:sz w:val="19"/>
               </w:rPr>
-              <w:t>Blocked by</w:t>
-            </w:r>
-          </w:p>
-        </w:tc>
-        <w:tc>
-          <w:tcPr>
-            <w:tcW w:type="dxa" w:w="5329"/>
+              <w:t>Pending action owner</w:t>
+            </w:r>
+          </w:p>
+        </w:tc>
+        <w:tc>
+          <w:tcPr>
+            <w:tcW w:type="dxa" w:w="5159"/>
             <w:shd w:val="clear" w:color="auto" w:fill="E8E8E3"/>
           </w:tcPr>
           <w:p>
@@ -2307,7 +2307,7 @@
                 <w:b/>
                 <w:sz w:val="19"/>
               </w:rPr>
-              <w:t>Is it ours?</w:t>
+              <w:t>Service Desk action required?</w:t>
             </w:r>
           </w:p>
         </w:tc>
@@ -2315,35 +2315,35 @@
       <w:tr>
         <w:tc>
           <w:tcPr>
-            <w:tcW w:type="dxa" w:w="1474"/>
-          </w:tcPr>
-          <w:p>
-            <w:pPr>
-              <w:spacing w:after="40" w:before="40"/>
-            </w:pPr>
-            <w:r/>
-            <w:r>
-              <w:rPr>
-                <w:sz w:val="19"/>
-              </w:rPr>
-              <w:t>Us</w:t>
-            </w:r>
-          </w:p>
-        </w:tc>
-        <w:tc>
-          <w:tcPr>
-            <w:tcW w:type="dxa" w:w="5329"/>
-          </w:tcPr>
-          <w:p>
-            <w:pPr>
-              <w:spacing w:after="40" w:before="40"/>
-            </w:pPr>
-            <w:r/>
-            <w:r>
-              <w:rPr>
-                <w:sz w:val="19"/>
-              </w:rPr>
-              <w:t>Nothing is stopping us. We owe the next action</w:t>
+            <w:tcW w:type="dxa" w:w="1644"/>
+          </w:tcPr>
+          <w:p>
+            <w:pPr>
+              <w:spacing w:after="40" w:before="40"/>
+            </w:pPr>
+            <w:r/>
+            <w:r>
+              <w:rPr>
+                <w:sz w:val="19"/>
+              </w:rPr>
+              <w:t>Service Desk</w:t>
+            </w:r>
+          </w:p>
+        </w:tc>
+        <w:tc>
+          <w:tcPr>
+            <w:tcW w:type="dxa" w:w="5159"/>
+          </w:tcPr>
+          <w:p>
+            <w:pPr>
+              <w:spacing w:after="40" w:before="40"/>
+            </w:pPr>
+            <w:r/>
+            <w:r>
+              <w:rPr>
+                <w:sz w:val="19"/>
+              </w:rPr>
+              <w:t>No external party is blocking the incident. The next action is owed by the Service Desk</w:t>
             </w:r>
           </w:p>
         </w:tc>
@@ -2368,7 +2368,7 @@
       <w:tr>
         <w:tc>
           <w:tcPr>
-            <w:tcW w:type="dxa" w:w="1474"/>
+            <w:tcW w:type="dxa" w:w="1644"/>
           </w:tcPr>
           <w:p>
             <w:pPr>
@@ -2385,18 +2385,18 @@
         </w:tc>
         <w:tc>
           <w:tcPr>
-            <w:tcW w:type="dxa" w:w="5329"/>
-          </w:tcPr>
-          <w:p>
-            <w:pPr>
-              <w:spacing w:after="40" w:before="40"/>
-            </w:pPr>
-            <w:r/>
-            <w:r>
-              <w:rPr>
-                <w:sz w:val="19"/>
-              </w:rPr>
-              <w:t>We are waiting on information or confirmation from the caller</w:t>
+            <w:tcW w:type="dxa" w:w="5159"/>
+          </w:tcPr>
+          <w:p>
+            <w:pPr>
+              <w:spacing w:after="40" w:before="40"/>
+            </w:pPr>
+            <w:r/>
+            <w:r>
+              <w:rPr>
+                <w:sz w:val="19"/>
+              </w:rPr>
+              <w:t>Awaiting information or confirmation from the caller</w:t>
             </w:r>
           </w:p>
         </w:tc>
@@ -2421,7 +2421,7 @@
       <w:tr>
         <w:tc>
           <w:tcPr>
-            <w:tcW w:type="dxa" w:w="1474"/>
+            <w:tcW w:type="dxa" w:w="1644"/>
           </w:tcPr>
           <w:p>
             <w:pPr>
@@ -2438,18 +2438,18 @@
         </w:tc>
         <w:tc>
           <w:tcPr>
-            <w:tcW w:type="dxa" w:w="5329"/>
-          </w:tcPr>
-          <w:p>
-            <w:pPr>
-              <w:spacing w:after="40" w:before="40"/>
-            </w:pPr>
-            <w:r/>
-            <w:r>
-              <w:rPr>
-                <w:sz w:val="19"/>
-              </w:rPr>
-              <w:t>A third party is holding it up</w:t>
+            <w:tcW w:type="dxa" w:w="5159"/>
+          </w:tcPr>
+          <w:p>
+            <w:pPr>
+              <w:spacing w:after="40" w:before="40"/>
+            </w:pPr>
+            <w:r/>
+            <w:r>
+              <w:rPr>
+                <w:sz w:val="19"/>
+              </w:rPr>
+              <w:t>A third party is responsible for the delay</w:t>
             </w:r>
           </w:p>
         </w:tc>
@@ -2466,7 +2466,7 @@
               <w:rPr>
                 <w:sz w:val="19"/>
               </w:rPr>
-              <w:t>No — but chase if it has been a while</w:t>
+              <w:t>No — but escalate if the target has been exceeded</w:t>
             </w:r>
           </w:p>
         </w:tc>
@@ -2474,7 +2474,7 @@
       <w:tr>
         <w:tc>
           <w:tcPr>
-            <w:tcW w:type="dxa" w:w="1474"/>
+            <w:tcW w:type="dxa" w:w="1644"/>
           </w:tcPr>
           <w:p>
             <w:pPr>
@@ -2491,18 +2491,18 @@
         </w:tc>
         <w:tc>
           <w:tcPr>
-            <w:tcW w:type="dxa" w:w="5329"/>
-          </w:tcPr>
-          <w:p>
-            <w:pPr>
-              <w:spacing w:after="40" w:before="40"/>
-            </w:pPr>
-            <w:r/>
-            <w:r>
-              <w:rPr>
-                <w:sz w:val="19"/>
-              </w:rPr>
-              <w:t>Waiting on a change request</w:t>
+            <w:tcW w:type="dxa" w:w="5159"/>
+          </w:tcPr>
+          <w:p>
+            <w:pPr>
+              <w:spacing w:after="40" w:before="40"/>
+            </w:pPr>
+            <w:r/>
+            <w:r>
+              <w:rPr>
+                <w:sz w:val="19"/>
+              </w:rPr>
+              <w:t>Awaiting a change request</w:t>
             </w:r>
           </w:p>
         </w:tc>
@@ -2527,7 +2527,7 @@
       <w:tr>
         <w:tc>
           <w:tcPr>
-            <w:tcW w:type="dxa" w:w="1474"/>
+            <w:tcW w:type="dxa" w:w="1644"/>
           </w:tcPr>
           <w:p>
             <w:pPr>
@@ -2544,18 +2544,18 @@
         </w:tc>
         <w:tc>
           <w:tcPr>
-            <w:tcW w:type="dxa" w:w="5329"/>
-          </w:tcPr>
-          <w:p>
-            <w:pPr>
-              <w:spacing w:after="40" w:before="40"/>
-            </w:pPr>
-            <w:r/>
-            <w:r>
-              <w:rPr>
-                <w:sz w:val="19"/>
-              </w:rPr>
-              <w:t>Waiting on a problem record</w:t>
+            <w:tcW w:type="dxa" w:w="5159"/>
+          </w:tcPr>
+          <w:p>
+            <w:pPr>
+              <w:spacing w:after="40" w:before="40"/>
+            </w:pPr>
+            <w:r/>
+            <w:r>
+              <w:rPr>
+                <w:sz w:val="19"/>
+              </w:rPr>
+              <w:t>Awaiting a problem record</w:t>
             </w:r>
           </w:p>
         </w:tc>
@@ -2580,7 +2580,7 @@
       <w:tr>
         <w:tc>
           <w:tcPr>
-            <w:tcW w:type="dxa" w:w="1474"/>
+            <w:tcW w:type="dxa" w:w="1644"/>
           </w:tcPr>
           <w:p>
             <w:pPr>
@@ -2597,18 +2597,18 @@
         </w:tc>
         <w:tc>
           <w:tcPr>
-            <w:tcW w:type="dxa" w:w="5329"/>
-          </w:tcPr>
-          <w:p>
-            <w:pPr>
-              <w:spacing w:after="40" w:before="40"/>
-            </w:pPr>
-            <w:r/>
-            <w:r>
-              <w:rPr>
-                <w:sz w:val="19"/>
-              </w:rPr>
-              <w:t>Waiting on someone to approve something</w:t>
+            <w:tcW w:type="dxa" w:w="5159"/>
+          </w:tcPr>
+          <w:p>
+            <w:pPr>
+              <w:spacing w:after="40" w:before="40"/>
+            </w:pPr>
+            <w:r/>
+            <w:r>
+              <w:rPr>
+                <w:sz w:val="19"/>
+              </w:rPr>
+              <w:t>Awaiting an approval decision</w:t>
             </w:r>
           </w:p>
         </w:tc>
@@ -3493,7 +3493,7 @@
               <w:rPr>
                 <w:sz w:val="19"/>
               </w:rPr>
-              <w:t>Age</w:t>
+              <w:t>Ticket age</w:t>
             </w:r>
           </w:p>
         </w:tc>
@@ -3527,7 +3527,7 @@
               <w:rPr>
                 <w:sz w:val="19"/>
               </w:rPr>
-              <w:t>How far past the 5-day threshold. Deliberately a small ingredient — age on its own means very little</w:t>
+              <w:t>How far beyond the five-day threshold. Deliberately a minor component — age alone carries little meaning</w:t>
             </w:r>
           </w:p>
         </w:tc>
@@ -3546,7 +3546,7 @@
               <w:rPr>
                 <w:sz w:val="19"/>
               </w:rPr>
-              <w:t>Priority</w:t>
+              <w:t>Business priority</w:t>
             </w:r>
           </w:p>
         </w:tc>
@@ -3599,7 +3599,7 @@
               <w:rPr>
                 <w:sz w:val="19"/>
               </w:rPr>
-              <w:t>Past expected time</w:t>
+              <w:t>Duration overrun</w:t>
             </w:r>
           </w:p>
         </w:tc>
@@ -3633,7 +3633,7 @@
               <w:rPr>
                 <w:sz w:val="19"/>
               </w:rPr>
-              <w:t>Slow compared with other tickets of the same type, not slow in the abstract</w:t>
+              <w:t>Slow relative to comparable incidents of the same type, not slow in the abstract</w:t>
             </w:r>
           </w:p>
         </w:tc>
@@ -3652,7 +3652,7 @@
               <w:rPr>
                 <w:sz w:val="19"/>
               </w:rPr>
-              <w:t>Reassignment churn</w:t>
+              <w:t>Reassignment activity</w:t>
             </w:r>
           </w:p>
         </w:tc>
@@ -3686,7 +3686,7 @@
               <w:rPr>
                 <w:sz w:val="19"/>
               </w:rPr>
-              <w:t>Bounced between queues, or reopened</w:t>
+              <w:t>Moved between queues, or reopened</w:t>
             </w:r>
           </w:p>
         </w:tc>
@@ -3715,14 +3715,14 @@
           <w:color w:val="1C5CAB"/>
           <w:sz w:val="20"/>
         </w:rPr>
-        <w:t xml:space="preserve">Slow "for its own type".  </w:t>
+        <w:t xml:space="preserve">Assessed relative to comparable incidents.  </w:t>
       </w:r>
       <w:r>
         <w:rPr>
           <w:color w:val="52514E"/>
           <w:sz w:val="20"/>
         </w:rPr>
-        <w:t>The tool learns how long tickets in each category normally take by looking at ones you have already resolved. A printer request that usually takes two days is flagged at four; a laptop build that normally takes ten days is not. This stops slow-by-nature work sitting permanently red.</w:t>
+        <w:t>The tool establishes how long incidents in each category normally take by examining you have already resolved. A printer request that usually takes two days is flagged at four; a laptop build that normally takes ten days is not. This stops slow-by-nature work sitting permanently red.</w:t>
       </w:r>
     </w:p>
     <w:p>
@@ -3988,7 +3988,7 @@
               <w:rPr>
                 <w:sz w:val="19"/>
               </w:rPr>
-              <w:t>No recent action</w:t>
+              <w:t>No recent activity</w:t>
             </w:r>
           </w:p>
         </w:tc>
@@ -4005,7 +4005,7 @@
               <w:rPr>
                 <w:sz w:val="19"/>
               </w:rPr>
-              <w:t>Untouched for two days or more</w:t>
+              <w:t>No Service Desk action for two days or more</w:t>
             </w:r>
           </w:p>
         </w:tc>
@@ -4022,7 +4022,7 @@
               <w:rPr>
                 <w:sz w:val="19"/>
               </w:rPr>
-              <w:t>A nudge, usually</w:t>
+              <w:t>Review and progress</w:t>
             </w:r>
           </w:p>
         </w:tc>
@@ -4041,7 +4041,7 @@
               <w:rPr>
                 <w:sz w:val="19"/>
               </w:rPr>
-              <w:t>Caller awaiting reply</w:t>
+              <w:t>Caller awaiting response</w:t>
             </w:r>
           </w:p>
         </w:tc>
@@ -4058,7 +4058,7 @@
               <w:rPr>
                 <w:sz w:val="19"/>
               </w:rPr>
-              <w:t>The caller responded and has had no answer since</w:t>
+              <w:t>The caller has responded and received no reply since</w:t>
             </w:r>
           </w:p>
         </w:tc>
@@ -4075,7 +4075,7 @@
               <w:rPr>
                 <w:sz w:val="19"/>
               </w:rPr>
-              <w:t>Reply. This is the most avoidable kind of delay there is</w:t>
+              <w:t>Respond. This is the most avoidable category of delay</w:t>
             </w:r>
           </w:p>
         </w:tc>
@@ -4094,7 +4094,7 @@
               <w:rPr>
                 <w:sz w:val="19"/>
               </w:rPr>
-              <w:t>Blocker already closed</w:t>
+              <w:t>Dependency already closed</w:t>
             </w:r>
           </w:p>
         </w:tc>
@@ -4111,7 +4111,7 @@
               <w:rPr>
                 <w:sz w:val="19"/>
               </w:rPr>
-              <w:t>The change or problem it was waiting for has closed</w:t>
+              <w:t>The change or problem it was awaiting has closed</w:t>
             </w:r>
           </w:p>
         </w:tc>
@@ -4128,7 +4128,7 @@
               <w:rPr>
                 <w:sz w:val="19"/>
               </w:rPr>
-              <w:t>Take it off hold and carry on</w:t>
+              <w:t>Remove the hold and progress the incident</w:t>
             </w:r>
           </w:p>
         </w:tc>
@@ -4181,7 +4181,7 @@
               <w:rPr>
                 <w:sz w:val="19"/>
               </w:rPr>
-              <w:t>Consider closing, per your local policy</w:t>
+              <w:t>Consider closure in line with local policy</w:t>
             </w:r>
           </w:p>
         </w:tc>
@@ -4200,7 +4200,7 @@
               <w:rPr>
                 <w:sz w:val="19"/>
               </w:rPr>
-              <w:t>Past expected time</w:t>
+              <w:t>Expected duration exceeded</w:t>
             </w:r>
           </w:p>
         </w:tc>
@@ -4217,7 +4217,7 @@
               <w:rPr>
                 <w:sz w:val="19"/>
               </w:rPr>
-              <w:t>Slower than tickets of the same type usually take</w:t>
+              <w:t>Slower than comparable incidents of the same type</w:t>
             </w:r>
           </w:p>
         </w:tc>
@@ -4234,7 +4234,7 @@
               <w:rPr>
                 <w:sz w:val="19"/>
               </w:rPr>
-              <w:t>Worth understanding why</w:t>
+              <w:t>Establish the reason</w:t>
             </w:r>
           </w:p>
         </w:tc>
@@ -4253,7 +4253,7 @@
               <w:rPr>
                 <w:sz w:val="19"/>
               </w:rPr>
-              <w:t>KB not attached</w:t>
+              <w:t>Knowledge article not linked</w:t>
             </w:r>
           </w:p>
         </w:tc>
@@ -4270,7 +4270,7 @@
               <w:rPr>
                 <w:sz w:val="19"/>
               </w:rPr>
-              <w:t>A knowledge article covers this and was not linked</w:t>
+              <w:t>A knowledge article covers this incident and was not linked</w:t>
             </w:r>
           </w:p>
         </w:tc>
@@ -6432,7 +6432,7 @@
               <w:rPr>
                 <w:sz w:val="19"/>
               </w:rPr>
-              <w:t>Resolve now</w:t>
+              <w:t>Resolve</w:t>
             </w:r>
           </w:p>
         </w:tc>
@@ -6449,7 +6449,7 @@
               <w:rPr>
                 <w:sz w:val="19"/>
               </w:rPr>
-              <w:t>Read the similar incident it cites. If that fix applies, apply it, and attach the KB article while you are there</w:t>
+              <w:t>Review the comparable incident cited. If that resolution applies, apply it, and link the knowledge article at the same time</w:t>
             </w:r>
           </w:p>
         </w:tc>
@@ -6468,7 +6468,7 @@
               <w:rPr>
                 <w:sz w:val="19"/>
               </w:rPr>
-              <w:t>Waiting on dependency</w:t>
+              <w:t>Awaiting dependency</w:t>
             </w:r>
           </w:p>
         </w:tc>
@@ -6485,7 +6485,7 @@
               <w:rPr>
                 <w:sz w:val="19"/>
               </w:rPr>
-              <w:t>Nothing to do. Check the dependency reference in the sidebar is still open — if it has closed, the flag will already have changed to "Blocker already closed"</w:t>
+              <w:t>No action required. Confirm the dependency reference in the sidebar is still open — if it has closed, the flag will already have changed to "Dependency already closed"</w:t>
             </w:r>
           </w:p>
         </w:tc>
@@ -6504,7 +6504,7 @@
               <w:rPr>
                 <w:sz w:val="19"/>
               </w:rPr>
-              <w:t>Close (no response)</w:t>
+              <w:t>Close - no caller response</w:t>
             </w:r>
           </w:p>
         </w:tc>
@@ -6521,7 +6521,7 @@
               <w:rPr>
                 <w:sz w:val="19"/>
               </w:rPr>
-              <w:t>Follow your local closure policy. The tool has checked that the follow-ups are documented; it is not authorising the closure</w:t>
+              <w:t>Follow local closure policy. The tool has verified that the follow-ups are documented; it is not authorising the closure</w:t>
             </w:r>
           </w:p>
         </w:tc>
@@ -7106,7 +7106,7 @@
               <w:rPr>
                 <w:sz w:val="19"/>
               </w:rPr>
-              <w:t>The shape of the backlog at a glance. "Waiting on us" is the one that matters — it is your real workload</w:t>
+              <w:t>The composition of the backlog at a glance. "Awaiting Service Desk" is the figure that matters — it represents the actual workload</w:t>
             </w:r>
           </w:p>
         </w:tc>
@@ -7214,7 +7214,7 @@
               <w:rPr>
                 <w:sz w:val="19"/>
               </w:rPr>
-              <w:t>Follow-ups exhausted and caller silent. Handle as a batch rather than one at a time</w:t>
+              <w:t>Follow-ups exhausted and caller silent. Process as a batch rather than individually</w:t>
             </w:r>
           </w:p>
         </w:tc>
@@ -7345,7 +7345,7 @@
               <w:rPr>
                 <w:sz w:val="19"/>
               </w:rPr>
-              <w:t>Blocked by = Us</w:t>
+              <w:t>Pending action owner = Service Desk</w:t>
             </w:r>
           </w:p>
         </w:tc>
@@ -7362,7 +7362,7 @@
               <w:rPr>
                 <w:sz w:val="19"/>
               </w:rPr>
-              <w:t>"What is genuinely ours this morning?"</w:t>
+              <w:t>"What requires Service Desk action this morning?"</w:t>
             </w:r>
           </w:p>
         </w:tc>
@@ -7381,7 +7381,7 @@
               <w:rPr>
                 <w:sz w:val="19"/>
               </w:rPr>
-              <w:t>Risk flag = Caller awaiting reply</w:t>
+              <w:t>Risk flag = Caller awaiting response</w:t>
             </w:r>
           </w:p>
         </w:tc>
@@ -7398,7 +7398,7 @@
               <w:rPr>
                 <w:sz w:val="19"/>
               </w:rPr>
-              <w:t>"Who are we leaving hanging?"</w:t>
+              <w:t>"Which callers are awaiting a reply?"</w:t>
             </w:r>
           </w:p>
         </w:tc>
@@ -7417,7 +7417,7 @@
               <w:rPr>
                 <w:sz w:val="19"/>
               </w:rPr>
-              <w:t>Risk flag = Blocker already closed</w:t>
+              <w:t>Risk flag = Dependency already closed</w:t>
             </w:r>
           </w:p>
         </w:tc>
@@ -7434,7 +7434,7 @@
               <w:rPr>
                 <w:sz w:val="19"/>
               </w:rPr>
-              <w:t>"What is stuck for no reason at all?"</w:t>
+              <w:t>"What is held with no remaining reason?"</w:t>
             </w:r>
           </w:p>
         </w:tc>
@@ -7453,7 +7453,7 @@
               <w:rPr>
                 <w:sz w:val="19"/>
               </w:rPr>
-              <w:t>Suggested step = Close (no response)</w:t>
+              <w:t>Suggested step = Close - no caller response</w:t>
             </w:r>
           </w:p>
         </w:tc>
@@ -7470,7 +7470,7 @@
               <w:rPr>
                 <w:sz w:val="19"/>
               </w:rPr>
-              <w:t>"What can we clear out?"</w:t>
+              <w:t>"What can be cleared?"</w:t>
             </w:r>
           </w:p>
         </w:tc>
@@ -7542,7 +7542,7 @@
               <w:rPr>
                 <w:sz w:val="19"/>
               </w:rPr>
-              <w:t>"Just show me the fires"</w:t>
+              <w:t>"Show only the most urgent incidents"</w:t>
             </w:r>
           </w:p>
         </w:tc>
@@ -8674,7 +8674,7 @@
         <w:pStyle w:val="Heading2"/>
       </w:pPr>
       <w:r>
-        <w:t>6.1 The blocker cleared and nobody noticed</w:t>
+        <w:t>6.1 The dependency closed and was not noticed</w:t>
       </w:r>
     </w:p>
     <w:p>
@@ -8732,7 +8732,7 @@
           <w:color w:val="0B0B0B"/>
           <w:sz w:val="17"/>
         </w:rPr>
-        <w:t>Asha Rao · 19 days old · idle 11.4 days · Blocked by: Us</w:t>
+        <w:t>Asha Rao · 19 days old · idle 11.4 days · Pending action owner: Service Desk</w:t>
       </w:r>
     </w:p>
     <w:p>
@@ -8747,7 +8747,7 @@
           <w:color w:val="0B0B0B"/>
           <w:sz w:val="17"/>
         </w:rPr>
-        <w:t>Flags: Blocker already closed · No action 4+ days · Past expected time</w:t>
+        <w:t>Flags: Dependency already closed · Prolonged inactivity · Expected duration exceeded</w:t>
       </w:r>
     </w:p>
     <w:p>
@@ -8773,7 +8773,7 @@
           <w:i w:val="0"/>
           <w:sz w:val="21"/>
         </w:rPr>
-        <w:t>"Resolve now" — confidence 86%. The change this ticket was held for, CHG0044321, closed successfully eleven days ago.</w:t>
+        <w:t>"Resolve" — confidence 86%. The change this incident was held for, CHG0044321, closed successfully eleven days ago.</w:t>
       </w:r>
     </w:p>
     <w:p>
@@ -8794,7 +8794,7 @@
           <w:i w:val="0"/>
           <w:sz w:val="21"/>
         </w:rPr>
-        <w:t>The ticket is still On Hold — Awaiting Change. Nobody is at fault: ServiceNow does not tell you when a dependency closes, so the ticket simply sat there. The tool noticed the change state and moved the ball back to us.</w:t>
+        <w:t>The ticket is still On Hold — Awaiting Change. Nobody is at fault: ServiceNow does not report when a dependency closes, so the incident simply remained on hold. The tool detected the change state and returned the pending action owner to the Service Desk.</w:t>
       </w:r>
     </w:p>
     <w:p>

</xml_diff>

<commit_message>
Generalized to all Assignment Groups
</commit_message>
<xml_diff>
--- a/docs/Aged_Ticket_Advisor_User_Manual.docx
+++ b/docs/Aged_Ticket_Advisor_User_Manual.docx
@@ -27,7 +27,7 @@
           <w:color w:val="52514E"/>
           <w:sz w:val="25"/>
         </w:rPr>
-        <w:t>For Service Desk Agents and Team Leads</w:t>
+        <w:t>For Support Agents and Team Leads</w:t>
       </w:r>
     </w:p>
     <w:p/>
@@ -196,7 +196,7 @@
               <w:rPr>
                 <w:sz w:val="19"/>
               </w:rPr>
-              <w:t>Service Desk agents and team leads</w:t>
+              <w:t>Support agents and team leads, across every queue the tool covers</w:t>
             </w:r>
           </w:p>
         </w:tc>
@@ -304,7 +304,7 @@
               <w:rPr>
                 <w:sz w:val="19"/>
               </w:rPr>
-              <w:t>1.0  ·  01 October 2026</w:t>
+              <w:t>1.0  ·  20 October 2026</w:t>
             </w:r>
           </w:p>
         </w:tc>
@@ -1830,7 +1830,7 @@
               <w:rPr>
                 <w:sz w:val="19"/>
               </w:rPr>
-              <w:t>Arrives on weekday mornings from the Service Desk Advisor address</w:t>
+              <w:t>Arrives on weekday mornings from the Aged Ticket Advisor address</w:t>
             </w:r>
           </w:p>
         </w:tc>
@@ -1979,7 +1979,7 @@
           <w:i w:val="0"/>
           <w:sz w:val="21"/>
         </w:rPr>
-        <w:t>Age is how long the incident has existed. Idle time is how long it has been since anyone in the Service Desk acted on it.</w:t>
+        <w:t>Age is how long the incident has existed. Idle time is how long it has been since anyone on your team acted on it.</w:t>
       </w:r>
     </w:p>
     <w:p>
@@ -2007,7 +2007,7 @@
           <w:color w:val="52514E"/>
           <w:sz w:val="20"/>
         </w:rPr>
-        <w:t>An incident can be three weeks old and entirely healthy — a hardware order with a confirmed delivery date, for example. An incident eight days old with no Service Desk action for six of them is a different situation entirely.</w:t>
+        <w:t>An incident can be three weeks old and entirely healthy — a hardware order with a confirmed delivery date, for example. An incident eight days old with no action by your team for six of them is a different situation entirely.</w:t>
       </w:r>
     </w:p>
     <w:p>
@@ -2495,7 +2495,7 @@
               <w:rPr>
                 <w:sz w:val="19"/>
               </w:rPr>
-              <w:t>The caller adding a comment (that is caller activity, not Service Desk activity — and it usually means a response is now owed)</w:t>
+              <w:t>The caller adding a comment (that is caller activity, not activity by your team — and it usually means a response is now owed)</w:t>
             </w:r>
           </w:p>
         </w:tc>
@@ -2521,7 +2521,7 @@
           <w:i w:val="0"/>
           <w:sz w:val="21"/>
         </w:rPr>
-        <w:t>Every aged incident is assigned a Pending Action Owner. This answers the question that matters most to a lead: is this incident awaiting Service Desk action, or is it legitimately awaiting another party?</w:t>
+        <w:t>Every aged incident is assigned a Pending Action Owner. This answers the question that matters most to a lead: is this incident awaiting our action, or is it legitimately awaiting another party?</w:t>
       </w:r>
     </w:p>
     <w:tbl>
@@ -2591,7 +2591,7 @@
                 <w:b/>
                 <w:sz w:val="19"/>
               </w:rPr>
-              <w:t>Service Desk action required?</w:t>
+              <w:t>Action required from us?</w:t>
             </w:r>
           </w:p>
         </w:tc>
@@ -2610,7 +2610,7 @@
               <w:rPr>
                 <w:sz w:val="19"/>
               </w:rPr>
-              <w:t>Service Desk</w:t>
+              <w:t>Assigned team</w:t>
             </w:r>
           </w:p>
         </w:tc>
@@ -2627,7 +2627,7 @@
               <w:rPr>
                 <w:sz w:val="19"/>
               </w:rPr>
-              <w:t>No external party is blocking the incident. The next action is owed by the Service Desk</w:t>
+              <w:t>No external party is blocking the incident. The next action is owed by whichever team the incident is assigned to</w:t>
             </w:r>
           </w:p>
         </w:tc>
@@ -4289,7 +4289,7 @@
               <w:rPr>
                 <w:sz w:val="19"/>
               </w:rPr>
-              <w:t>No Service Desk action for two days or more</w:t>
+              <w:t>No action by the assigned team for two days or more</w:t>
             </w:r>
           </w:p>
         </w:tc>
@@ -7629,7 +7629,7 @@
               <w:rPr>
                 <w:sz w:val="19"/>
               </w:rPr>
-              <w:t>Pending action owner = Service Desk</w:t>
+              <w:t>Pending action owner = Assigned team</w:t>
             </w:r>
           </w:p>
         </w:tc>
@@ -7646,7 +7646,7 @@
               <w:rPr>
                 <w:sz w:val="19"/>
               </w:rPr>
-              <w:t>"What requires Service Desk action this morning?"</w:t>
+              <w:t>"What requires action from us this morning?"</w:t>
             </w:r>
           </w:p>
         </w:tc>
@@ -9016,7 +9016,7 @@
           <w:color w:val="0B0B0B"/>
           <w:sz w:val="17"/>
         </w:rPr>
-        <w:t>Asha Rao · 19 days old · idle 11.4 days · Pending action owner: Service Desk</w:t>
+        <w:t>Asha Rao · 19 days old · idle 11.4 days · Pending action owner: Assigned team</w:t>
       </w:r>
     </w:p>
     <w:p>
@@ -9078,7 +9078,7 @@
           <w:i w:val="0"/>
           <w:sz w:val="21"/>
         </w:rPr>
-        <w:t>The ticket is still On Hold — Awaiting Change. Nobody is at fault: ServiceNow does not report when a dependency closes, so the incident simply remained on hold. The tool detected the change state and returned the pending action owner to the Service Desk.</w:t>
+        <w:t>The ticket is still On Hold — Awaiting Change. Nobody is at fault: ServiceNow does not report when a dependency closes, so the incident simply remained on hold. The tool detected the change state and returned the pending action owner to the the assigned team.</w:t>
       </w:r>
     </w:p>
     <w:p>
@@ -9242,7 +9242,7 @@
           <w:i w:val="0"/>
           <w:sz w:val="21"/>
         </w:rPr>
-        <w:t>Reply to the caller today. This is the single most avoidable category of delay in any service desk, and the easiest for the tool to catch.</w:t>
+        <w:t>Reply to the caller today. This is the single most avoidable category of delay in any support queue, and the easiest for the tool to catch.</w:t>
       </w:r>
     </w:p>
     <w:p>
@@ -10651,7 +10651,7 @@
               <w:rPr>
                 <w:sz w:val="19"/>
               </w:rPr>
-              <w:t>Is it going to replace service desk jobs?</w:t>
+              <w:t>Is it going to replace support jobs?</w:t>
             </w:r>
           </w:p>
         </w:tc>
@@ -12842,7 +12842,7 @@
         <w:color w:val="898781"/>
         <w:sz w:val="16"/>
       </w:rPr>
-      <w:t>Service Desk - Agents and Team Leads</w:t>
+      <w:t>IT Support - Agents and Team Leads</w:t>
     </w:r>
   </w:p>
 </w:hdr>

</xml_diff>